<commit_message>
Update report generation rules
</commit_message>
<xml_diff>
--- a/output/st_joseph_s_hospital_savannah_ga_us_controllers_84253fab8cc5_july_2026_report.docx
+++ b/output/st_joseph_s_hospital_savannah_ga_us_controllers_84253fab8cc5_july_2026_report.docx
@@ -351,7 +351,7 @@
               <w:rPr>
                 <w:sz w:val="18"/>
               </w:rPr>
-              <w:t>21 September 2026</w:t>
+              <w:t>22 September 2026</w:t>
             </w:r>
           </w:p>
         </w:tc>
@@ -793,7 +793,7 @@
           <w:i w:val="0"/>
           <w:sz w:val="20"/>
         </w:rPr>
-        <w:t>Water efficiency was Excellent. Conductivity averaged 597.64 uS/cm against the 570-630 uS/cm Controller Setpoint range, with 83.7% of readings in range. Makeup conductivity was 224.4 uS/cm, target COC was 2.67, and actual COC was 2.66, giving only 0.4% deviation from target.</w:t>
+        <w:t>The average conductivity is 597.6 µS/cm, which is within the recommended setpoint range of 570-630 µS/cm. Conductivity remained broadly stable from about 596.3 µS/cm at the start of the month to 599.0 µS/cm at the end. Recommendation: makeup and blowdown control are balanced, so tower cycles remained steady.</w:t>
       </w:r>
     </w:p>
     <w:p>
@@ -867,7 +867,7 @@
           <w:i w:val="0"/>
           <w:sz w:val="20"/>
         </w:rPr>
-        <w:t>The July service note documented low ORP related to a clogged sample line, plus a recommendation to inspect the dosing pump, probe, onsite inventory, FRC level, and pH probe. Recommended follow-up: Traced Product was not maintained while conductivity was maintained, so verify product inventory, pump prime, feed delivery, and fluorometer calibration. Check FRC during the upcoming service visit to confirm oxidizing biocide residual. Measure dip-slide CFU during the upcoming service visit to confirm microbial control. Verify phosphate and silica residuals during the next service visit.</w:t>
+        <w:t>Recommended follow-up: Traced Product was not maintained while conductivity was maintained, so verify product inventory, pump prime, feed delivery, and fluorometer calibration. Check FRC during the upcoming service visit to confirm oxidizing biocide residual. Measure dip-slide CFU during the upcoming service visit to confirm microbial control. Verify phosphate and silica residuals during the next service visit.</w:t>
       </w:r>
     </w:p>
     <w:p>
@@ -913,21 +913,18 @@
         <w:tblLook w:firstColumn="1" w:firstRow="1" w:lastColumn="0" w:lastRow="0" w:noHBand="0" w:noVBand="1" w:val="04A0"/>
       </w:tblPr>
       <w:tblGrid>
-        <w:gridCol w:w="1009"/>
-        <w:gridCol w:w="1009"/>
-        <w:gridCol w:w="1009"/>
-        <w:gridCol w:w="1009"/>
-        <w:gridCol w:w="1009"/>
-        <w:gridCol w:w="1009"/>
-        <w:gridCol w:w="1009"/>
-        <w:gridCol w:w="1009"/>
-        <w:gridCol w:w="1009"/>
-        <w:gridCol w:w="1009"/>
+        <w:gridCol w:w="1441"/>
+        <w:gridCol w:w="1441"/>
+        <w:gridCol w:w="1441"/>
+        <w:gridCol w:w="1441"/>
+        <w:gridCol w:w="1441"/>
+        <w:gridCol w:w="1441"/>
+        <w:gridCol w:w="1441"/>
       </w:tblGrid>
       <w:tr>
         <w:tc>
           <w:tcPr>
-            <w:tcW w:type="dxa" w:w="1814"/>
+            <w:tcW w:type="dxa" w:w="2041"/>
             <w:shd w:val="clear" w:color="auto" w:fill="00857C"/>
           </w:tcPr>
           <w:p>
@@ -946,7 +943,7 @@
         </w:tc>
         <w:tc>
           <w:tcPr>
-            <w:tcW w:type="dxa" w:w="1247"/>
+            <w:tcW w:type="dxa" w:w="1417"/>
             <w:shd w:val="clear" w:color="auto" w:fill="00857C"/>
           </w:tcPr>
           <w:p>
@@ -965,7 +962,7 @@
         </w:tc>
         <w:tc>
           <w:tcPr>
-            <w:tcW w:type="dxa" w:w="850"/>
+            <w:tcW w:type="dxa" w:w="1020"/>
             <w:shd w:val="clear" w:color="auto" w:fill="00857C"/>
           </w:tcPr>
           <w:p>
@@ -984,64 +981,7 @@
         </w:tc>
         <w:tc>
           <w:tcPr>
-            <w:tcW w:type="dxa" w:w="850"/>
-            <w:shd w:val="clear" w:color="auto" w:fill="00857C"/>
-          </w:tcPr>
-          <w:p>
-            <w:pPr>
-              <w:spacing w:before="60" w:after="60"/>
-            </w:pPr>
-            <w:r>
-              <w:rPr>
-                <w:b/>
-                <w:color w:val="FFFFFF"/>
-                <w:sz w:val="18"/>
-              </w:rPr>
-              <w:t>Std Dev</w:t>
-            </w:r>
-          </w:p>
-        </w:tc>
-        <w:tc>
-          <w:tcPr>
-            <w:tcW w:type="dxa" w:w="794"/>
-            <w:shd w:val="clear" w:color="auto" w:fill="00857C"/>
-          </w:tcPr>
-          <w:p>
-            <w:pPr>
-              <w:spacing w:before="60" w:after="60"/>
-            </w:pPr>
-            <w:r>
-              <w:rPr>
-                <w:b/>
-                <w:color w:val="FFFFFF"/>
-                <w:sz w:val="18"/>
-              </w:rPr>
-              <w:t>Min</w:t>
-            </w:r>
-          </w:p>
-        </w:tc>
-        <w:tc>
-          <w:tcPr>
-            <w:tcW w:type="dxa" w:w="794"/>
-            <w:shd w:val="clear" w:color="auto" w:fill="00857C"/>
-          </w:tcPr>
-          <w:p>
-            <w:pPr>
-              <w:spacing w:before="60" w:after="60"/>
-            </w:pPr>
-            <w:r>
-              <w:rPr>
-                <w:b/>
-                <w:color w:val="FFFFFF"/>
-                <w:sz w:val="18"/>
-              </w:rPr>
-              <w:t>Max</w:t>
-            </w:r>
-          </w:p>
-        </w:tc>
-        <w:tc>
-          <w:tcPr>
-            <w:tcW w:type="dxa" w:w="964"/>
+            <w:tcW w:type="dxa" w:w="1077"/>
             <w:shd w:val="clear" w:color="auto" w:fill="00857C"/>
           </w:tcPr>
           <w:p>
@@ -1060,7 +1000,7 @@
         </w:tc>
         <w:tc>
           <w:tcPr>
-            <w:tcW w:type="dxa" w:w="964"/>
+            <w:tcW w:type="dxa" w:w="1077"/>
             <w:shd w:val="clear" w:color="auto" w:fill="00857C"/>
           </w:tcPr>
           <w:p>
@@ -1079,7 +1019,7 @@
         </w:tc>
         <w:tc>
           <w:tcPr>
-            <w:tcW w:type="dxa" w:w="1020"/>
+            <w:tcW w:type="dxa" w:w="1134"/>
             <w:shd w:val="clear" w:color="auto" w:fill="00857C"/>
           </w:tcPr>
           <w:p>
@@ -1098,7 +1038,7 @@
         </w:tc>
         <w:tc>
           <w:tcPr>
-            <w:tcW w:type="dxa" w:w="1247"/>
+            <w:tcW w:type="dxa" w:w="1361"/>
             <w:shd w:val="clear" w:color="auto" w:fill="00857C"/>
           </w:tcPr>
           <w:p>
@@ -1119,7 +1059,7 @@
       <w:tr>
         <w:tc>
           <w:tcPr>
-            <w:tcW w:type="dxa" w:w="1814"/>
+            <w:tcW w:type="dxa" w:w="2041"/>
             <w:shd w:val="clear" w:color="auto" w:fill="FFFFFF"/>
           </w:tcPr>
           <w:p>
@@ -1136,7 +1076,7 @@
         </w:tc>
         <w:tc>
           <w:tcPr>
-            <w:tcW w:type="dxa" w:w="1247"/>
+            <w:tcW w:type="dxa" w:w="1417"/>
             <w:shd w:val="clear" w:color="auto" w:fill="FFFFFF"/>
           </w:tcPr>
           <w:p>
@@ -1153,7 +1093,7 @@
         </w:tc>
         <w:tc>
           <w:tcPr>
-            <w:tcW w:type="dxa" w:w="850"/>
+            <w:tcW w:type="dxa" w:w="1020"/>
             <w:shd w:val="clear" w:color="auto" w:fill="FFFFFF"/>
           </w:tcPr>
           <w:p>
@@ -1170,58 +1110,7 @@
         </w:tc>
         <w:tc>
           <w:tcPr>
-            <w:tcW w:type="dxa" w:w="850"/>
-            <w:shd w:val="clear" w:color="auto" w:fill="FFFFFF"/>
-          </w:tcPr>
-          <w:p>
-            <w:pPr>
-              <w:spacing w:before="60" w:after="60"/>
-            </w:pPr>
-            <w:r>
-              <w:rPr>
-                <w:sz w:val="18"/>
-              </w:rPr>
-              <w:t>0.000</w:t>
-            </w:r>
-          </w:p>
-        </w:tc>
-        <w:tc>
-          <w:tcPr>
-            <w:tcW w:type="dxa" w:w="794"/>
-            <w:shd w:val="clear" w:color="auto" w:fill="FFFFFF"/>
-          </w:tcPr>
-          <w:p>
-            <w:pPr>
-              <w:spacing w:before="60" w:after="60"/>
-            </w:pPr>
-            <w:r>
-              <w:rPr>
-                <w:sz w:val="18"/>
-              </w:rPr>
-              <w:t>0.100</w:t>
-            </w:r>
-          </w:p>
-        </w:tc>
-        <w:tc>
-          <w:tcPr>
-            <w:tcW w:type="dxa" w:w="794"/>
-            <w:shd w:val="clear" w:color="auto" w:fill="FFFFFF"/>
-          </w:tcPr>
-          <w:p>
-            <w:pPr>
-              <w:spacing w:before="60" w:after="60"/>
-            </w:pPr>
-            <w:r>
-              <w:rPr>
-                <w:sz w:val="18"/>
-              </w:rPr>
-              <w:t>0.100</w:t>
-            </w:r>
-          </w:p>
-        </w:tc>
-        <w:tc>
-          <w:tcPr>
-            <w:tcW w:type="dxa" w:w="964"/>
+            <w:tcW w:type="dxa" w:w="1077"/>
             <w:shd w:val="clear" w:color="auto" w:fill="FFFFFF"/>
           </w:tcPr>
           <w:p>
@@ -1238,7 +1127,7 @@
         </w:tc>
         <w:tc>
           <w:tcPr>
-            <w:tcW w:type="dxa" w:w="964"/>
+            <w:tcW w:type="dxa" w:w="1077"/>
             <w:shd w:val="clear" w:color="auto" w:fill="FFFFFF"/>
           </w:tcPr>
           <w:p>
@@ -1255,7 +1144,7 @@
         </w:tc>
         <w:tc>
           <w:tcPr>
-            <w:tcW w:type="dxa" w:w="1020"/>
+            <w:tcW w:type="dxa" w:w="1134"/>
             <w:shd w:val="clear" w:color="auto" w:fill="FFFFFF"/>
           </w:tcPr>
           <w:p>
@@ -1272,7 +1161,7 @@
         </w:tc>
         <w:tc>
           <w:tcPr>
-            <w:tcW w:type="dxa" w:w="1247"/>
+            <w:tcW w:type="dxa" w:w="1361"/>
             <w:shd w:val="clear" w:color="auto" w:fill="FFFFFF"/>
           </w:tcPr>
           <w:p>
@@ -1291,7 +1180,7 @@
       <w:tr>
         <w:tc>
           <w:tcPr>
-            <w:tcW w:type="dxa" w:w="1814"/>
+            <w:tcW w:type="dxa" w:w="2041"/>
             <w:shd w:val="clear" w:color="auto" w:fill="F2F8F7"/>
           </w:tcPr>
           <w:p>
@@ -1308,7 +1197,7 @@
         </w:tc>
         <w:tc>
           <w:tcPr>
-            <w:tcW w:type="dxa" w:w="1247"/>
+            <w:tcW w:type="dxa" w:w="1417"/>
             <w:shd w:val="clear" w:color="auto" w:fill="F2F8F7"/>
           </w:tcPr>
           <w:p>
@@ -1325,7 +1214,7 @@
         </w:tc>
         <w:tc>
           <w:tcPr>
-            <w:tcW w:type="dxa" w:w="850"/>
+            <w:tcW w:type="dxa" w:w="1020"/>
             <w:shd w:val="clear" w:color="auto" w:fill="F2F8F7"/>
           </w:tcPr>
           <w:p>
@@ -1342,58 +1231,7 @@
         </w:tc>
         <w:tc>
           <w:tcPr>
-            <w:tcW w:type="dxa" w:w="850"/>
-            <w:shd w:val="clear" w:color="auto" w:fill="F2F8F7"/>
-          </w:tcPr>
-          <w:p>
-            <w:pPr>
-              <w:spacing w:before="60" w:after="60"/>
-            </w:pPr>
-            <w:r>
-              <w:rPr>
-                <w:sz w:val="18"/>
-              </w:rPr>
-              <w:t>0.002</w:t>
-            </w:r>
-          </w:p>
-        </w:tc>
-        <w:tc>
-          <w:tcPr>
-            <w:tcW w:type="dxa" w:w="794"/>
-            <w:shd w:val="clear" w:color="auto" w:fill="F2F8F7"/>
-          </w:tcPr>
-          <w:p>
-            <w:pPr>
-              <w:spacing w:before="60" w:after="60"/>
-            </w:pPr>
-            <w:r>
-              <w:rPr>
-                <w:sz w:val="18"/>
-              </w:rPr>
-              <w:t>0.000</w:t>
-            </w:r>
-          </w:p>
-        </w:tc>
-        <w:tc>
-          <w:tcPr>
-            <w:tcW w:type="dxa" w:w="794"/>
-            <w:shd w:val="clear" w:color="auto" w:fill="F2F8F7"/>
-          </w:tcPr>
-          <w:p>
-            <w:pPr>
-              <w:spacing w:before="60" w:after="60"/>
-            </w:pPr>
-            <w:r>
-              <w:rPr>
-                <w:sz w:val="18"/>
-              </w:rPr>
-              <w:t>0.026</w:t>
-            </w:r>
-          </w:p>
-        </w:tc>
-        <w:tc>
-          <w:tcPr>
-            <w:tcW w:type="dxa" w:w="964"/>
+            <w:tcW w:type="dxa" w:w="1077"/>
             <w:shd w:val="clear" w:color="auto" w:fill="F2F8F7"/>
           </w:tcPr>
           <w:p>
@@ -1410,7 +1248,7 @@
         </w:tc>
         <w:tc>
           <w:tcPr>
-            <w:tcW w:type="dxa" w:w="964"/>
+            <w:tcW w:type="dxa" w:w="1077"/>
             <w:shd w:val="clear" w:color="auto" w:fill="F2F8F7"/>
           </w:tcPr>
           <w:p>
@@ -1427,7 +1265,7 @@
         </w:tc>
         <w:tc>
           <w:tcPr>
-            <w:tcW w:type="dxa" w:w="1020"/>
+            <w:tcW w:type="dxa" w:w="1134"/>
             <w:shd w:val="clear" w:color="auto" w:fill="F2F8F7"/>
           </w:tcPr>
           <w:p>
@@ -1444,7 +1282,7 @@
         </w:tc>
         <w:tc>
           <w:tcPr>
-            <w:tcW w:type="dxa" w:w="1247"/>
+            <w:tcW w:type="dxa" w:w="1361"/>
             <w:shd w:val="clear" w:color="auto" w:fill="F2F8F7"/>
           </w:tcPr>
           <w:p>
@@ -1463,7 +1301,7 @@
       <w:tr>
         <w:tc>
           <w:tcPr>
-            <w:tcW w:type="dxa" w:w="1814"/>
+            <w:tcW w:type="dxa" w:w="2041"/>
             <w:shd w:val="clear" w:color="auto" w:fill="FFFFFF"/>
           </w:tcPr>
           <w:p>
@@ -1480,7 +1318,7 @@
         </w:tc>
         <w:tc>
           <w:tcPr>
-            <w:tcW w:type="dxa" w:w="1247"/>
+            <w:tcW w:type="dxa" w:w="1417"/>
             <w:shd w:val="clear" w:color="auto" w:fill="FFFFFF"/>
           </w:tcPr>
           <w:p>
@@ -1497,7 +1335,7 @@
         </w:tc>
         <w:tc>
           <w:tcPr>
-            <w:tcW w:type="dxa" w:w="850"/>
+            <w:tcW w:type="dxa" w:w="1020"/>
             <w:shd w:val="clear" w:color="auto" w:fill="FFFFFF"/>
           </w:tcPr>
           <w:p>
@@ -1514,58 +1352,7 @@
         </w:tc>
         <w:tc>
           <w:tcPr>
-            <w:tcW w:type="dxa" w:w="850"/>
-            <w:shd w:val="clear" w:color="auto" w:fill="FFFFFF"/>
-          </w:tcPr>
-          <w:p>
-            <w:pPr>
-              <w:spacing w:before="60" w:after="60"/>
-            </w:pPr>
-            <w:r>
-              <w:rPr>
-                <w:sz w:val="18"/>
-              </w:rPr>
-              <w:t>4.287</w:t>
-            </w:r>
-          </w:p>
-        </w:tc>
-        <w:tc>
-          <w:tcPr>
-            <w:tcW w:type="dxa" w:w="794"/>
-            <w:shd w:val="clear" w:color="auto" w:fill="FFFFFF"/>
-          </w:tcPr>
-          <w:p>
-            <w:pPr>
-              <w:spacing w:before="60" w:after="60"/>
-            </w:pPr>
-            <w:r>
-              <w:rPr>
-                <w:sz w:val="18"/>
-              </w:rPr>
-              <w:t>39.315</w:t>
-            </w:r>
-          </w:p>
-        </w:tc>
-        <w:tc>
-          <w:tcPr>
-            <w:tcW w:type="dxa" w:w="794"/>
-            <w:shd w:val="clear" w:color="auto" w:fill="FFFFFF"/>
-          </w:tcPr>
-          <w:p>
-            <w:pPr>
-              <w:spacing w:before="60" w:after="60"/>
-            </w:pPr>
-            <w:r>
-              <w:rPr>
-                <w:sz w:val="18"/>
-              </w:rPr>
-              <w:t>68.553</w:t>
-            </w:r>
-          </w:p>
-        </w:tc>
-        <w:tc>
-          <w:tcPr>
-            <w:tcW w:type="dxa" w:w="964"/>
+            <w:tcW w:type="dxa" w:w="1077"/>
             <w:shd w:val="clear" w:color="auto" w:fill="FFFFFF"/>
           </w:tcPr>
           <w:p>
@@ -1582,7 +1369,7 @@
         </w:tc>
         <w:tc>
           <w:tcPr>
-            <w:tcW w:type="dxa" w:w="964"/>
+            <w:tcW w:type="dxa" w:w="1077"/>
             <w:shd w:val="clear" w:color="auto" w:fill="FFFFFF"/>
           </w:tcPr>
           <w:p>
@@ -1599,7 +1386,7 @@
         </w:tc>
         <w:tc>
           <w:tcPr>
-            <w:tcW w:type="dxa" w:w="1020"/>
+            <w:tcW w:type="dxa" w:w="1134"/>
             <w:shd w:val="clear" w:color="auto" w:fill="FFFFFF"/>
           </w:tcPr>
           <w:p>
@@ -1616,7 +1403,7 @@
         </w:tc>
         <w:tc>
           <w:tcPr>
-            <w:tcW w:type="dxa" w:w="1247"/>
+            <w:tcW w:type="dxa" w:w="1361"/>
             <w:shd w:val="clear" w:color="auto" w:fill="FFFFFF"/>
           </w:tcPr>
           <w:p>
@@ -1635,7 +1422,7 @@
       <w:tr>
         <w:tc>
           <w:tcPr>
-            <w:tcW w:type="dxa" w:w="1814"/>
+            <w:tcW w:type="dxa" w:w="2041"/>
             <w:shd w:val="clear" w:color="auto" w:fill="F2F8F7"/>
           </w:tcPr>
           <w:p>
@@ -1652,7 +1439,7 @@
         </w:tc>
         <w:tc>
           <w:tcPr>
-            <w:tcW w:type="dxa" w:w="1247"/>
+            <w:tcW w:type="dxa" w:w="1417"/>
             <w:shd w:val="clear" w:color="auto" w:fill="F2F8F7"/>
           </w:tcPr>
           <w:p>
@@ -1669,7 +1456,7 @@
         </w:tc>
         <w:tc>
           <w:tcPr>
-            <w:tcW w:type="dxa" w:w="850"/>
+            <w:tcW w:type="dxa" w:w="1020"/>
             <w:shd w:val="clear" w:color="auto" w:fill="F2F8F7"/>
           </w:tcPr>
           <w:p>
@@ -1686,58 +1473,7 @@
         </w:tc>
         <w:tc>
           <w:tcPr>
-            <w:tcW w:type="dxa" w:w="850"/>
-            <w:shd w:val="clear" w:color="auto" w:fill="F2F8F7"/>
-          </w:tcPr>
-          <w:p>
-            <w:pPr>
-              <w:spacing w:before="60" w:after="60"/>
-            </w:pPr>
-            <w:r>
-              <w:rPr>
-                <w:sz w:val="18"/>
-              </w:rPr>
-              <w:t>22.753</w:t>
-            </w:r>
-          </w:p>
-        </w:tc>
-        <w:tc>
-          <w:tcPr>
-            <w:tcW w:type="dxa" w:w="794"/>
-            <w:shd w:val="clear" w:color="auto" w:fill="F2F8F7"/>
-          </w:tcPr>
-          <w:p>
-            <w:pPr>
-              <w:spacing w:before="60" w:after="60"/>
-            </w:pPr>
-            <w:r>
-              <w:rPr>
-                <w:sz w:val="18"/>
-              </w:rPr>
-              <w:t>467.688</w:t>
-            </w:r>
-          </w:p>
-        </w:tc>
-        <w:tc>
-          <w:tcPr>
-            <w:tcW w:type="dxa" w:w="794"/>
-            <w:shd w:val="clear" w:color="auto" w:fill="F2F8F7"/>
-          </w:tcPr>
-          <w:p>
-            <w:pPr>
-              <w:spacing w:before="60" w:after="60"/>
-            </w:pPr>
-            <w:r>
-              <w:rPr>
-                <w:sz w:val="18"/>
-              </w:rPr>
-              <w:t>662.806</w:t>
-            </w:r>
-          </w:p>
-        </w:tc>
-        <w:tc>
-          <w:tcPr>
-            <w:tcW w:type="dxa" w:w="964"/>
+            <w:tcW w:type="dxa" w:w="1077"/>
             <w:shd w:val="clear" w:color="auto" w:fill="F2F8F7"/>
           </w:tcPr>
           <w:p>
@@ -1754,7 +1490,7 @@
         </w:tc>
         <w:tc>
           <w:tcPr>
-            <w:tcW w:type="dxa" w:w="964"/>
+            <w:tcW w:type="dxa" w:w="1077"/>
             <w:shd w:val="clear" w:color="auto" w:fill="F2F8F7"/>
           </w:tcPr>
           <w:p>
@@ -1771,7 +1507,7 @@
         </w:tc>
         <w:tc>
           <w:tcPr>
-            <w:tcW w:type="dxa" w:w="1020"/>
+            <w:tcW w:type="dxa" w:w="1134"/>
             <w:shd w:val="clear" w:color="auto" w:fill="F2F8F7"/>
           </w:tcPr>
           <w:p>
@@ -1788,7 +1524,7 @@
         </w:tc>
         <w:tc>
           <w:tcPr>
-            <w:tcW w:type="dxa" w:w="1247"/>
+            <w:tcW w:type="dxa" w:w="1361"/>
             <w:shd w:val="clear" w:color="auto" w:fill="F2F8F7"/>
           </w:tcPr>
           <w:p>
@@ -1807,7 +1543,7 @@
       <w:tr>
         <w:tc>
           <w:tcPr>
-            <w:tcW w:type="dxa" w:w="1814"/>
+            <w:tcW w:type="dxa" w:w="2041"/>
             <w:shd w:val="clear" w:color="auto" w:fill="FFFFFF"/>
           </w:tcPr>
           <w:p>
@@ -1824,7 +1560,7 @@
         </w:tc>
         <w:tc>
           <w:tcPr>
-            <w:tcW w:type="dxa" w:w="1247"/>
+            <w:tcW w:type="dxa" w:w="1417"/>
             <w:shd w:val="clear" w:color="auto" w:fill="FFFFFF"/>
           </w:tcPr>
           <w:p>
@@ -1841,7 +1577,7 @@
         </w:tc>
         <w:tc>
           <w:tcPr>
-            <w:tcW w:type="dxa" w:w="850"/>
+            <w:tcW w:type="dxa" w:w="1020"/>
             <w:shd w:val="clear" w:color="auto" w:fill="FFFFFF"/>
           </w:tcPr>
           <w:p>
@@ -1858,58 +1594,7 @@
         </w:tc>
         <w:tc>
           <w:tcPr>
-            <w:tcW w:type="dxa" w:w="850"/>
-            <w:shd w:val="clear" w:color="auto" w:fill="FFFFFF"/>
-          </w:tcPr>
-          <w:p>
-            <w:pPr>
-              <w:spacing w:before="60" w:after="60"/>
-            </w:pPr>
-            <w:r>
-              <w:rPr>
-                <w:sz w:val="18"/>
-              </w:rPr>
-              <w:t>0.039</w:t>
-            </w:r>
-          </w:p>
-        </w:tc>
-        <w:tc>
-          <w:tcPr>
-            <w:tcW w:type="dxa" w:w="794"/>
-            <w:shd w:val="clear" w:color="auto" w:fill="FFFFFF"/>
-          </w:tcPr>
-          <w:p>
-            <w:pPr>
-              <w:spacing w:before="60" w:after="60"/>
-            </w:pPr>
-            <w:r>
-              <w:rPr>
-                <w:sz w:val="18"/>
-              </w:rPr>
-              <w:t>9.119</w:t>
-            </w:r>
-          </w:p>
-        </w:tc>
-        <w:tc>
-          <w:tcPr>
-            <w:tcW w:type="dxa" w:w="794"/>
-            <w:shd w:val="clear" w:color="auto" w:fill="FFFFFF"/>
-          </w:tcPr>
-          <w:p>
-            <w:pPr>
-              <w:spacing w:before="60" w:after="60"/>
-            </w:pPr>
-            <w:r>
-              <w:rPr>
-                <w:sz w:val="18"/>
-              </w:rPr>
-              <w:t>9.376</w:t>
-            </w:r>
-          </w:p>
-        </w:tc>
-        <w:tc>
-          <w:tcPr>
-            <w:tcW w:type="dxa" w:w="964"/>
+            <w:tcW w:type="dxa" w:w="1077"/>
             <w:shd w:val="clear" w:color="auto" w:fill="FFFFFF"/>
           </w:tcPr>
           <w:p>
@@ -1926,7 +1611,7 @@
         </w:tc>
         <w:tc>
           <w:tcPr>
-            <w:tcW w:type="dxa" w:w="964"/>
+            <w:tcW w:type="dxa" w:w="1077"/>
             <w:shd w:val="clear" w:color="auto" w:fill="FFFFFF"/>
           </w:tcPr>
           <w:p>
@@ -1943,7 +1628,7 @@
         </w:tc>
         <w:tc>
           <w:tcPr>
-            <w:tcW w:type="dxa" w:w="1020"/>
+            <w:tcW w:type="dxa" w:w="1134"/>
             <w:shd w:val="clear" w:color="auto" w:fill="FFFFFF"/>
           </w:tcPr>
           <w:p>
@@ -1960,7 +1645,7 @@
         </w:tc>
         <w:tc>
           <w:tcPr>
-            <w:tcW w:type="dxa" w:w="1247"/>
+            <w:tcW w:type="dxa" w:w="1361"/>
             <w:shd w:val="clear" w:color="auto" w:fill="FFFFFF"/>
           </w:tcPr>
           <w:p>
@@ -1971,7 +1656,7 @@
               <w:rPr>
                 <w:sz w:val="18"/>
               </w:rPr>
-              <w:t>ℹ Info</w:t>
+              <w:t>✓ Excellent</w:t>
             </w:r>
           </w:p>
         </w:tc>
@@ -1979,7 +1664,7 @@
       <w:tr>
         <w:tc>
           <w:tcPr>
-            <w:tcW w:type="dxa" w:w="1814"/>
+            <w:tcW w:type="dxa" w:w="2041"/>
             <w:shd w:val="clear" w:color="auto" w:fill="F2F8F7"/>
           </w:tcPr>
           <w:p>
@@ -1990,13 +1675,13 @@
               <w:rPr>
                 <w:sz w:val="18"/>
               </w:rPr>
-              <w:t>ORP (mV)</w:t>
+              <w:t>Turbidity (NTU)</w:t>
             </w:r>
           </w:p>
         </w:tc>
         <w:tc>
           <w:tcPr>
-            <w:tcW w:type="dxa" w:w="1247"/>
+            <w:tcW w:type="dxa" w:w="1417"/>
             <w:shd w:val="clear" w:color="auto" w:fill="F2F8F7"/>
           </w:tcPr>
           <w:p>
@@ -2013,108 +1698,6 @@
         </w:tc>
         <w:tc>
           <w:tcPr>
-            <w:tcW w:type="dxa" w:w="850"/>
-            <w:shd w:val="clear" w:color="auto" w:fill="F2F8F7"/>
-          </w:tcPr>
-          <w:p>
-            <w:pPr>
-              <w:spacing w:before="60" w:after="60"/>
-            </w:pPr>
-            <w:r>
-              <w:rPr>
-                <w:sz w:val="18"/>
-              </w:rPr>
-              <w:t>38.306</w:t>
-            </w:r>
-          </w:p>
-        </w:tc>
-        <w:tc>
-          <w:tcPr>
-            <w:tcW w:type="dxa" w:w="850"/>
-            <w:shd w:val="clear" w:color="auto" w:fill="F2F8F7"/>
-          </w:tcPr>
-          <w:p>
-            <w:pPr>
-              <w:spacing w:before="60" w:after="60"/>
-            </w:pPr>
-            <w:r>
-              <w:rPr>
-                <w:sz w:val="18"/>
-              </w:rPr>
-              <w:t>50.107</w:t>
-            </w:r>
-          </w:p>
-        </w:tc>
-        <w:tc>
-          <w:tcPr>
-            <w:tcW w:type="dxa" w:w="794"/>
-            <w:shd w:val="clear" w:color="auto" w:fill="F2F8F7"/>
-          </w:tcPr>
-          <w:p>
-            <w:pPr>
-              <w:spacing w:before="60" w:after="60"/>
-            </w:pPr>
-            <w:r>
-              <w:rPr>
-                <w:sz w:val="18"/>
-              </w:rPr>
-              <w:t>-31.119</w:t>
-            </w:r>
-          </w:p>
-        </w:tc>
-        <w:tc>
-          <w:tcPr>
-            <w:tcW w:type="dxa" w:w="794"/>
-            <w:shd w:val="clear" w:color="auto" w:fill="F2F8F7"/>
-          </w:tcPr>
-          <w:p>
-            <w:pPr>
-              <w:spacing w:before="60" w:after="60"/>
-            </w:pPr>
-            <w:r>
-              <w:rPr>
-                <w:sz w:val="18"/>
-              </w:rPr>
-              <w:t>266.546</w:t>
-            </w:r>
-          </w:p>
-        </w:tc>
-        <w:tc>
-          <w:tcPr>
-            <w:tcW w:type="dxa" w:w="964"/>
-            <w:shd w:val="clear" w:color="auto" w:fill="F2F8F7"/>
-          </w:tcPr>
-          <w:p>
-            <w:pPr>
-              <w:spacing w:before="60" w:after="60"/>
-            </w:pPr>
-            <w:r>
-              <w:rPr>
-                <w:sz w:val="18"/>
-              </w:rPr>
-              <w:t>–</w:t>
-            </w:r>
-          </w:p>
-        </w:tc>
-        <w:tc>
-          <w:tcPr>
-            <w:tcW w:type="dxa" w:w="964"/>
-            <w:shd w:val="clear" w:color="auto" w:fill="F2F8F7"/>
-          </w:tcPr>
-          <w:p>
-            <w:pPr>
-              <w:spacing w:before="60" w:after="60"/>
-            </w:pPr>
-            <w:r>
-              <w:rPr>
-                <w:sz w:val="18"/>
-              </w:rPr>
-              <w:t>–</w:t>
-            </w:r>
-          </w:p>
-        </w:tc>
-        <w:tc>
-          <w:tcPr>
             <w:tcW w:type="dxa" w:w="1020"/>
             <w:shd w:val="clear" w:color="auto" w:fill="F2F8F7"/>
           </w:tcPr>
@@ -2126,13 +1709,13 @@
               <w:rPr>
                 <w:sz w:val="18"/>
               </w:rPr>
-              <w:t>–</w:t>
+              <w:t>0.005</w:t>
             </w:r>
           </w:p>
         </w:tc>
         <w:tc>
           <w:tcPr>
-            <w:tcW w:type="dxa" w:w="1247"/>
+            <w:tcW w:type="dxa" w:w="1077"/>
             <w:shd w:val="clear" w:color="auto" w:fill="F2F8F7"/>
           </w:tcPr>
           <w:p>
@@ -2143,7 +1726,58 @@
               <w:rPr>
                 <w:sz w:val="18"/>
               </w:rPr>
-              <w:t>See chart</w:t>
+              <w:t>0.0</w:t>
+            </w:r>
+          </w:p>
+        </w:tc>
+        <w:tc>
+          <w:tcPr>
+            <w:tcW w:type="dxa" w:w="1077"/>
+            <w:shd w:val="clear" w:color="auto" w:fill="F2F8F7"/>
+          </w:tcPr>
+          <w:p>
+            <w:pPr>
+              <w:spacing w:before="60" w:after="60"/>
+            </w:pPr>
+            <w:r>
+              <w:rPr>
+                <w:sz w:val="18"/>
+              </w:rPr>
+              <w:t>75.0</w:t>
+            </w:r>
+          </w:p>
+        </w:tc>
+        <w:tc>
+          <w:tcPr>
+            <w:tcW w:type="dxa" w:w="1134"/>
+            <w:shd w:val="clear" w:color="auto" w:fill="F2F8F7"/>
+          </w:tcPr>
+          <w:p>
+            <w:pPr>
+              <w:spacing w:before="60" w:after="60"/>
+            </w:pPr>
+            <w:r>
+              <w:rPr>
+                <w:sz w:val="18"/>
+              </w:rPr>
+              <w:t>100.0%</w:t>
+            </w:r>
+          </w:p>
+        </w:tc>
+        <w:tc>
+          <w:tcPr>
+            <w:tcW w:type="dxa" w:w="1361"/>
+            <w:shd w:val="clear" w:color="auto" w:fill="F2F8F7"/>
+          </w:tcPr>
+          <w:p>
+            <w:pPr>
+              <w:spacing w:before="60" w:after="60"/>
+            </w:pPr>
+            <w:r>
+              <w:rPr>
+                <w:sz w:val="18"/>
+              </w:rPr>
+              <w:t>✓ Excellent</w:t>
             </w:r>
           </w:p>
         </w:tc>
@@ -2151,7 +1785,7 @@
       <w:tr>
         <w:tc>
           <w:tcPr>
-            <w:tcW w:type="dxa" w:w="1814"/>
+            <w:tcW w:type="dxa" w:w="2041"/>
             <w:shd w:val="clear" w:color="auto" w:fill="FFFFFF"/>
           </w:tcPr>
           <w:p>
@@ -2162,13 +1796,13 @@
               <w:rPr>
                 <w:sz w:val="18"/>
               </w:rPr>
-              <w:t>Turbidity (NTU)</w:t>
+              <w:t>Cell Fouling (%)</w:t>
             </w:r>
           </w:p>
         </w:tc>
         <w:tc>
           <w:tcPr>
-            <w:tcW w:type="dxa" w:w="1247"/>
+            <w:tcW w:type="dxa" w:w="1417"/>
             <w:shd w:val="clear" w:color="auto" w:fill="FFFFFF"/>
           </w:tcPr>
           <w:p>
@@ -2185,180 +1819,8 @@
         </w:tc>
         <w:tc>
           <w:tcPr>
-            <w:tcW w:type="dxa" w:w="850"/>
-            <w:shd w:val="clear" w:color="auto" w:fill="FFFFFF"/>
-          </w:tcPr>
-          <w:p>
-            <w:pPr>
-              <w:spacing w:before="60" w:after="60"/>
-            </w:pPr>
-            <w:r>
-              <w:rPr>
-                <w:sz w:val="18"/>
-              </w:rPr>
-              <w:t>0.005</w:t>
-            </w:r>
-          </w:p>
-        </w:tc>
-        <w:tc>
-          <w:tcPr>
-            <w:tcW w:type="dxa" w:w="850"/>
-            <w:shd w:val="clear" w:color="auto" w:fill="FFFFFF"/>
-          </w:tcPr>
-          <w:p>
-            <w:pPr>
-              <w:spacing w:before="60" w:after="60"/>
-            </w:pPr>
-            <w:r>
-              <w:rPr>
-                <w:sz w:val="18"/>
-              </w:rPr>
-              <w:t>0.194</w:t>
-            </w:r>
-          </w:p>
-        </w:tc>
-        <w:tc>
-          <w:tcPr>
-            <w:tcW w:type="dxa" w:w="794"/>
-            <w:shd w:val="clear" w:color="auto" w:fill="FFFFFF"/>
-          </w:tcPr>
-          <w:p>
-            <w:pPr>
-              <w:spacing w:before="60" w:after="60"/>
-            </w:pPr>
-            <w:r>
-              <w:rPr>
-                <w:sz w:val="18"/>
-              </w:rPr>
-              <w:t>0.000</w:t>
-            </w:r>
-          </w:p>
-        </w:tc>
-        <w:tc>
-          <w:tcPr>
-            <w:tcW w:type="dxa" w:w="794"/>
-            <w:shd w:val="clear" w:color="auto" w:fill="FFFFFF"/>
-          </w:tcPr>
-          <w:p>
-            <w:pPr>
-              <w:spacing w:before="60" w:after="60"/>
-            </w:pPr>
-            <w:r>
-              <w:rPr>
-                <w:sz w:val="18"/>
-              </w:rPr>
-              <w:t>7.829</w:t>
-            </w:r>
-          </w:p>
-        </w:tc>
-        <w:tc>
-          <w:tcPr>
-            <w:tcW w:type="dxa" w:w="964"/>
-            <w:shd w:val="clear" w:color="auto" w:fill="FFFFFF"/>
-          </w:tcPr>
-          <w:p>
-            <w:pPr>
-              <w:spacing w:before="60" w:after="60"/>
-            </w:pPr>
-            <w:r>
-              <w:rPr>
-                <w:sz w:val="18"/>
-              </w:rPr>
-              <w:t>–</w:t>
-            </w:r>
-          </w:p>
-        </w:tc>
-        <w:tc>
-          <w:tcPr>
-            <w:tcW w:type="dxa" w:w="964"/>
-            <w:shd w:val="clear" w:color="auto" w:fill="FFFFFF"/>
-          </w:tcPr>
-          <w:p>
-            <w:pPr>
-              <w:spacing w:before="60" w:after="60"/>
-            </w:pPr>
-            <w:r>
-              <w:rPr>
-                <w:sz w:val="18"/>
-              </w:rPr>
-              <w:t>75.0</w:t>
-            </w:r>
-          </w:p>
-        </w:tc>
-        <w:tc>
-          <w:tcPr>
             <w:tcW w:type="dxa" w:w="1020"/>
             <w:shd w:val="clear" w:color="auto" w:fill="FFFFFF"/>
-          </w:tcPr>
-          <w:p>
-            <w:pPr>
-              <w:spacing w:before="60" w:after="60"/>
-            </w:pPr>
-            <w:r>
-              <w:rPr>
-                <w:sz w:val="18"/>
-              </w:rPr>
-              <w:t>–</w:t>
-            </w:r>
-          </w:p>
-        </w:tc>
-        <w:tc>
-          <w:tcPr>
-            <w:tcW w:type="dxa" w:w="1247"/>
-            <w:shd w:val="clear" w:color="auto" w:fill="FFFFFF"/>
-          </w:tcPr>
-          <w:p>
-            <w:pPr>
-              <w:spacing w:before="60" w:after="60"/>
-            </w:pPr>
-            <w:r>
-              <w:rPr>
-                <w:sz w:val="18"/>
-              </w:rPr>
-              <w:t>ℹ Info</w:t>
-            </w:r>
-          </w:p>
-        </w:tc>
-      </w:tr>
-      <w:tr>
-        <w:tc>
-          <w:tcPr>
-            <w:tcW w:type="dxa" w:w="1814"/>
-            <w:shd w:val="clear" w:color="auto" w:fill="F2F8F7"/>
-          </w:tcPr>
-          <w:p>
-            <w:pPr>
-              <w:spacing w:before="60" w:after="60"/>
-            </w:pPr>
-            <w:r>
-              <w:rPr>
-                <w:sz w:val="18"/>
-              </w:rPr>
-              <w:t>Cell Fouling (%)</w:t>
-            </w:r>
-          </w:p>
-        </w:tc>
-        <w:tc>
-          <w:tcPr>
-            <w:tcW w:type="dxa" w:w="1247"/>
-            <w:shd w:val="clear" w:color="auto" w:fill="F2F8F7"/>
-          </w:tcPr>
-          <w:p>
-            <w:pPr>
-              <w:spacing w:before="60" w:after="60"/>
-            </w:pPr>
-            <w:r>
-              <w:rPr>
-                <w:sz w:val="18"/>
-              </w:rPr>
-              <w:t>ACM Skid</w:t>
-            </w:r>
-          </w:p>
-        </w:tc>
-        <w:tc>
-          <w:tcPr>
-            <w:tcW w:type="dxa" w:w="850"/>
-            <w:shd w:val="clear" w:color="auto" w:fill="F2F8F7"/>
           </w:tcPr>
           <w:p>
             <w:pPr>
@@ -2374,8 +1836,8 @@
         </w:tc>
         <w:tc>
           <w:tcPr>
-            <w:tcW w:type="dxa" w:w="850"/>
-            <w:shd w:val="clear" w:color="auto" w:fill="F2F8F7"/>
+            <w:tcW w:type="dxa" w:w="1077"/>
+            <w:shd w:val="clear" w:color="auto" w:fill="FFFFFF"/>
           </w:tcPr>
           <w:p>
             <w:pPr>
@@ -2385,65 +1847,14 @@
               <w:rPr>
                 <w:sz w:val="18"/>
               </w:rPr>
-              <w:t>1.216</w:t>
+              <w:t>0.0</w:t>
             </w:r>
           </w:p>
         </w:tc>
         <w:tc>
           <w:tcPr>
-            <w:tcW w:type="dxa" w:w="794"/>
-            <w:shd w:val="clear" w:color="auto" w:fill="F2F8F7"/>
-          </w:tcPr>
-          <w:p>
-            <w:pPr>
-              <w:spacing w:before="60" w:after="60"/>
-            </w:pPr>
-            <w:r>
-              <w:rPr>
-                <w:sz w:val="18"/>
-              </w:rPr>
-              <w:t>1.236</w:t>
-            </w:r>
-          </w:p>
-        </w:tc>
-        <w:tc>
-          <w:tcPr>
-            <w:tcW w:type="dxa" w:w="794"/>
-            <w:shd w:val="clear" w:color="auto" w:fill="F2F8F7"/>
-          </w:tcPr>
-          <w:p>
-            <w:pPr>
-              <w:spacing w:before="60" w:after="60"/>
-            </w:pPr>
-            <w:r>
-              <w:rPr>
-                <w:sz w:val="18"/>
-              </w:rPr>
-              <w:t>16.780</w:t>
-            </w:r>
-          </w:p>
-        </w:tc>
-        <w:tc>
-          <w:tcPr>
-            <w:tcW w:type="dxa" w:w="964"/>
-            <w:shd w:val="clear" w:color="auto" w:fill="F2F8F7"/>
-          </w:tcPr>
-          <w:p>
-            <w:pPr>
-              <w:spacing w:before="60" w:after="60"/>
-            </w:pPr>
-            <w:r>
-              <w:rPr>
-                <w:sz w:val="18"/>
-              </w:rPr>
-              <w:t>–</w:t>
-            </w:r>
-          </w:p>
-        </w:tc>
-        <w:tc>
-          <w:tcPr>
-            <w:tcW w:type="dxa" w:w="964"/>
-            <w:shd w:val="clear" w:color="auto" w:fill="F2F8F7"/>
+            <w:tcW w:type="dxa" w:w="1077"/>
+            <w:shd w:val="clear" w:color="auto" w:fill="FFFFFF"/>
           </w:tcPr>
           <w:p>
             <w:pPr>
@@ -2459,43 +1870,7 @@
         </w:tc>
         <w:tc>
           <w:tcPr>
-            <w:tcW w:type="dxa" w:w="1020"/>
-            <w:shd w:val="clear" w:color="auto" w:fill="F2F8F7"/>
-          </w:tcPr>
-          <w:p>
-            <w:pPr>
-              <w:spacing w:before="60" w:after="60"/>
-            </w:pPr>
-            <w:r>
-              <w:rPr>
-                <w:sz w:val="18"/>
-              </w:rPr>
-              <w:t>–</w:t>
-            </w:r>
-          </w:p>
-        </w:tc>
-        <w:tc>
-          <w:tcPr>
-            <w:tcW w:type="dxa" w:w="1247"/>
-            <w:shd w:val="clear" w:color="auto" w:fill="F2F8F7"/>
-          </w:tcPr>
-          <w:p>
-            <w:pPr>
-              <w:spacing w:before="60" w:after="60"/>
-            </w:pPr>
-            <w:r>
-              <w:rPr>
-                <w:sz w:val="18"/>
-              </w:rPr>
-              <w:t>ℹ Info</w:t>
-            </w:r>
-          </w:p>
-        </w:tc>
-      </w:tr>
-      <w:tr>
-        <w:tc>
-          <w:tcPr>
-            <w:tcW w:type="dxa" w:w="1814"/>
+            <w:tcW w:type="dxa" w:w="1134"/>
             <w:shd w:val="clear" w:color="auto" w:fill="FFFFFF"/>
           </w:tcPr>
           <w:p>
@@ -2506,13 +1881,13 @@
               <w:rPr>
                 <w:sz w:val="18"/>
               </w:rPr>
-              <w:t>FRC</w:t>
+              <w:t>100.0%</w:t>
             </w:r>
           </w:p>
         </w:tc>
         <w:tc>
           <w:tcPr>
-            <w:tcW w:type="dxa" w:w="1247"/>
+            <w:tcW w:type="dxa" w:w="1361"/>
             <w:shd w:val="clear" w:color="auto" w:fill="FFFFFF"/>
           </w:tcPr>
           <w:p>
@@ -2523,143 +1898,7 @@
               <w:rPr>
                 <w:sz w:val="18"/>
               </w:rPr>
-              <w:t>Field Data</w:t>
-            </w:r>
-          </w:p>
-        </w:tc>
-        <w:tc>
-          <w:tcPr>
-            <w:tcW w:type="dxa" w:w="850"/>
-            <w:shd w:val="clear" w:color="auto" w:fill="FFFFFF"/>
-          </w:tcPr>
-          <w:p>
-            <w:pPr>
-              <w:spacing w:before="60" w:after="60"/>
-            </w:pPr>
-            <w:r>
-              <w:rPr>
-                <w:sz w:val="18"/>
-              </w:rPr>
-              <w:t>Not avail.</w:t>
-            </w:r>
-          </w:p>
-        </w:tc>
-        <w:tc>
-          <w:tcPr>
-            <w:tcW w:type="dxa" w:w="850"/>
-            <w:shd w:val="clear" w:color="auto" w:fill="FFFFFF"/>
-          </w:tcPr>
-          <w:p>
-            <w:pPr>
-              <w:spacing w:before="60" w:after="60"/>
-            </w:pPr>
-            <w:r>
-              <w:rPr>
-                <w:sz w:val="18"/>
-              </w:rPr>
-              <w:t>–</w:t>
-            </w:r>
-          </w:p>
-        </w:tc>
-        <w:tc>
-          <w:tcPr>
-            <w:tcW w:type="dxa" w:w="794"/>
-            <w:shd w:val="clear" w:color="auto" w:fill="FFFFFF"/>
-          </w:tcPr>
-          <w:p>
-            <w:pPr>
-              <w:spacing w:before="60" w:after="60"/>
-            </w:pPr>
-            <w:r>
-              <w:rPr>
-                <w:sz w:val="18"/>
-              </w:rPr>
-              <w:t>–</w:t>
-            </w:r>
-          </w:p>
-        </w:tc>
-        <w:tc>
-          <w:tcPr>
-            <w:tcW w:type="dxa" w:w="794"/>
-            <w:shd w:val="clear" w:color="auto" w:fill="FFFFFF"/>
-          </w:tcPr>
-          <w:p>
-            <w:pPr>
-              <w:spacing w:before="60" w:after="60"/>
-            </w:pPr>
-            <w:r>
-              <w:rPr>
-                <w:sz w:val="18"/>
-              </w:rPr>
-              <w:t>–</w:t>
-            </w:r>
-          </w:p>
-        </w:tc>
-        <w:tc>
-          <w:tcPr>
-            <w:tcW w:type="dxa" w:w="964"/>
-            <w:shd w:val="clear" w:color="auto" w:fill="FFFFFF"/>
-          </w:tcPr>
-          <w:p>
-            <w:pPr>
-              <w:spacing w:before="60" w:after="60"/>
-            </w:pPr>
-            <w:r>
-              <w:rPr>
-                <w:sz w:val="18"/>
-              </w:rPr>
-              <w:t>–</w:t>
-            </w:r>
-          </w:p>
-        </w:tc>
-        <w:tc>
-          <w:tcPr>
-            <w:tcW w:type="dxa" w:w="964"/>
-            <w:shd w:val="clear" w:color="auto" w:fill="FFFFFF"/>
-          </w:tcPr>
-          <w:p>
-            <w:pPr>
-              <w:spacing w:before="60" w:after="60"/>
-            </w:pPr>
-            <w:r>
-              <w:rPr>
-                <w:sz w:val="18"/>
-              </w:rPr>
-              <w:t>–</w:t>
-            </w:r>
-          </w:p>
-        </w:tc>
-        <w:tc>
-          <w:tcPr>
-            <w:tcW w:type="dxa" w:w="1020"/>
-            <w:shd w:val="clear" w:color="auto" w:fill="FFFFFF"/>
-          </w:tcPr>
-          <w:p>
-            <w:pPr>
-              <w:spacing w:before="60" w:after="60"/>
-            </w:pPr>
-            <w:r>
-              <w:rPr>
-                <w:sz w:val="18"/>
-              </w:rPr>
-              <w:t>–</w:t>
-            </w:r>
-          </w:p>
-        </w:tc>
-        <w:tc>
-          <w:tcPr>
-            <w:tcW w:type="dxa" w:w="1247"/>
-            <w:shd w:val="clear" w:color="auto" w:fill="FFFFFF"/>
-          </w:tcPr>
-          <w:p>
-            <w:pPr>
-              <w:spacing w:before="60" w:after="60"/>
-            </w:pPr>
-            <w:r>
-              <w:rPr>
-                <w:sz w:val="18"/>
-              </w:rPr>
-              <w:t>⚠ Check</w:t>
+              <w:t>✓ Excellent</w:t>
             </w:r>
           </w:p>
         </w:tc>
@@ -2772,40 +2011,7 @@
           <w:color w:val="333333"/>
           <w:sz w:val="19"/>
         </w:rPr>
-        <w:t>Pattern: corrosion control is decreasing, but remains good against the target.</w:t>
-      </w:r>
-      <w:r>
-        <w:br/>
-      </w:r>
-      <w:r>
-        <w:rPr>
-          <w:i/>
-          <w:color w:val="333333"/>
-          <w:sz w:val="19"/>
-        </w:rPr>
-        <w:t>Mild steel corrosion remained broadly stable across the month, while copper corrosion decreased across the month.</w:t>
-      </w:r>
-      <w:r>
-        <w:br/>
-      </w:r>
-      <w:r>
-        <w:rPr>
-          <w:i/>
-          <w:color w:val="333333"/>
-          <w:sz w:val="19"/>
-        </w:rPr>
-        <w:t>MS was within the 3.0 MPY target, and Cu was within the 0.5 MPY target.</w:t>
-      </w:r>
-      <w:r>
-        <w:br/>
-      </w:r>
-      <w:r>
-        <w:rPr>
-          <w:i/>
-          <w:color w:val="333333"/>
-          <w:sz w:val="19"/>
-        </w:rPr>
-        <w:t>Likely reason: inhibitor residual and operating chemistry are keeping corrosion protected.</w:t>
+        <w:t>During the reporting period, the system remained under good control. The mild steel and copper corrosion rates averaged 0.10 mpy and 0.02 mpy, respectively, both of which are well within the recommended limits of &lt;5 mpy and &lt;0.5 mpy.</w:t>
       </w:r>
     </w:p>
     <w:p>
@@ -3014,7 +2220,7 @@
           <w:color w:val="333333"/>
           <w:sz w:val="19"/>
         </w:rPr>
-        <w:t>Pattern: ORP response is increasing across the month.</w:t>
+        <w:t>ORP did not show more than 50 mV spikes at least three times during the week from 08 July 2026 to 14 July 2026; no slug dosage of biocide is observed during this period. This could be due to lack of inventory, dosing pump lost prime, or a leak in the pump discharge line.</w:t>
       </w:r>
       <w:r>
         <w:br/>
@@ -3025,150 +2231,7 @@
           <w:color w:val="333333"/>
           <w:sz w:val="19"/>
         </w:rPr>
-        <w:t>ORP showed a visible spike response pattern during the month without relying on absolute ORP values.</w:t>
-      </w:r>
-      <w:r>
-        <w:br/>
-      </w:r>
-      <w:r>
-        <w:rPr>
-          <w:i/>
-          <w:color w:val="333333"/>
-          <w:sz w:val="19"/>
-        </w:rPr>
-        <w:t>Copper corrosion decreased across the month while the ORP pattern changed.</w:t>
-      </w:r>
-      <w:r>
-        <w:br/>
-      </w:r>
-      <w:r>
-        <w:rPr>
-          <w:i/>
-          <w:color w:val="333333"/>
-          <w:sz w:val="19"/>
-        </w:rPr>
-        <w:t>Likely reason: biocide response is present and corrosion inhibitor is preventing a copper upset.</w:t>
-      </w:r>
-    </w:p>
-    <w:p>
-      <w:pPr>
-        <w:spacing w:before="200" w:after="60"/>
-      </w:pPr>
-      <w:r>
-        <w:rPr>
-          <w:b/>
-          <w:color w:val="005F58"/>
-          <w:sz w:val="26"/>
-        </w:rPr>
-        <w:t>Oxidizing Biocide Pump Relay vs Copper Corrosion</w:t>
-      </w:r>
-    </w:p>
-    <w:p>
-      <w:pPr>
-        <w:jc w:val="center"/>
-      </w:pPr>
-      <w:r>
-        <w:drawing>
-          <wp:inline xmlns:a="http://schemas.openxmlformats.org/drawingml/2006/main" xmlns:pic="http://schemas.openxmlformats.org/drawingml/2006/picture">
-            <wp:extent cx="5486400" cy="2568696"/>
-            <wp:docPr id="4" name="Picture 4"/>
-            <wp:cNvGraphicFramePr>
-              <a:graphicFrameLocks noChangeAspect="1"/>
-            </wp:cNvGraphicFramePr>
-            <a:graphic>
-              <a:graphicData uri="http://schemas.openxmlformats.org/drawingml/2006/picture">
-                <pic:pic>
-                  <pic:nvPicPr>
-                    <pic:cNvPr id="0" name="st_joseph_s_hospital_savannah_ga_us_controllers_84253fab8cc5_july_2026_biocide_corrosion.png"/>
-                    <pic:cNvPicPr/>
-                  </pic:nvPicPr>
-                  <pic:blipFill>
-                    <a:blip r:embed="rId14"/>
-                    <a:stretch>
-                      <a:fillRect/>
-                    </a:stretch>
-                  </pic:blipFill>
-                  <pic:spPr>
-                    <a:xfrm>
-                      <a:off x="0" y="0"/>
-                      <a:ext cx="5486400" cy="2568696"/>
-                    </a:xfrm>
-                    <a:prstGeom prst="rect"/>
-                  </pic:spPr>
-                </pic:pic>
-              </a:graphicData>
-            </a:graphic>
-          </wp:inline>
-        </w:drawing>
-      </w:r>
-    </w:p>
-    <w:p>
-      <w:pPr>
-        <w:spacing w:after="120"/>
-        <w:jc w:val="center"/>
-      </w:pPr>
-      <w:r>
-        <w:rPr>
-          <w:i/>
-          <w:color w:val="444444"/>
-          <w:sz w:val="17"/>
-        </w:rPr>
-        <w:t>Figure 4: Oxidizing Biocide Pump Relay vs Copper Corrosion — July 2026</w:t>
-      </w:r>
-    </w:p>
-    <w:p>
-      <w:pPr>
-        <w:spacing w:before="40" w:after="200"/>
-      </w:pPr>
-      <w:r>
-        <w:rPr>
-          <w:b/>
-          <w:i/>
-          <w:color w:val="333333"/>
-          <w:sz w:val="19"/>
-        </w:rPr>
-        <w:t xml:space="preserve">Comment: </w:t>
-      </w:r>
-      <w:r>
-        <w:rPr>
-          <w:i/>
-          <w:color w:val="333333"/>
-          <w:sz w:val="19"/>
-        </w:rPr>
-        <w:t>Pattern: biocide feed versus copper corrosion is decreasing, but remains good against the target.</w:t>
-      </w:r>
-      <w:r>
-        <w:br/>
-      </w:r>
-      <w:r>
-        <w:rPr>
-          <w:i/>
-          <w:color w:val="333333"/>
-          <w:sz w:val="19"/>
-        </w:rPr>
-        <w:t>Biocide relay activity was present in the monthly trend.</w:t>
-      </w:r>
-      <w:r>
-        <w:br/>
-      </w:r>
-      <w:r>
-        <w:rPr>
-          <w:i/>
-          <w:color w:val="333333"/>
-          <w:sz w:val="19"/>
-        </w:rPr>
-        <w:t>Relay activity increased across the month when the month is split into early and late periods.</w:t>
-      </w:r>
-      <w:r>
-        <w:br/>
-      </w:r>
-      <w:r>
-        <w:rPr>
-          <w:i/>
-          <w:color w:val="333333"/>
-          <w:sz w:val="19"/>
-        </w:rPr>
-        <w:t>Likely reason: relay feed timing is adequate and copper corrosion remains protected.</w:t>
+        <w:t>Copper corrosion remained within the recommended limit of 0.5 mpy.</w:t>
       </w:r>
     </w:p>
     <w:p>
@@ -3192,7 +2255,7 @@
         <w:drawing>
           <wp:inline xmlns:a="http://schemas.openxmlformats.org/drawingml/2006/main" xmlns:pic="http://schemas.openxmlformats.org/drawingml/2006/picture">
             <wp:extent cx="5486400" cy="2566519"/>
-            <wp:docPr id="5" name="Picture 5"/>
+            <wp:docPr id="4" name="Picture 4"/>
             <wp:cNvGraphicFramePr>
               <a:graphicFrameLocks noChangeAspect="1"/>
             </wp:cNvGraphicFramePr>
@@ -3204,7 +2267,7 @@
                     <pic:cNvPicPr/>
                   </pic:nvPicPr>
                   <pic:blipFill>
-                    <a:blip r:embed="rId15"/>
+                    <a:blip r:embed="rId14"/>
                     <a:stretch>
                       <a:fillRect/>
                     </a:stretch>
@@ -3234,7 +2297,7 @@
           <w:color w:val="444444"/>
           <w:sz w:val="17"/>
         </w:rPr>
-        <w:t>Figure 5: Electrode Conductivity — July 2026</w:t>
+        <w:t>Figure 4: Electrode Conductivity — July 2026</w:t>
       </w:r>
     </w:p>
     <w:p>
@@ -3256,40 +2319,7 @@
           <w:color w:val="333333"/>
           <w:sz w:val="19"/>
         </w:rPr>
-        <w:t>Pattern: conductivity remains good and stable across the month.</w:t>
-      </w:r>
-      <w:r>
-        <w:br/>
-      </w:r>
-      <w:r>
-        <w:rPr>
-          <w:i/>
-          <w:color w:val="333333"/>
-          <w:sz w:val="19"/>
-        </w:rPr>
-        <w:t>The trend moved from about 596.3 µS/cm at the start to 599.0 µS/cm at the end.</w:t>
-      </w:r>
-      <w:r>
-        <w:br/>
-      </w:r>
-      <w:r>
-        <w:rPr>
-          <w:i/>
-          <w:color w:val="333333"/>
-          <w:sz w:val="19"/>
-        </w:rPr>
-        <w:t>The conductivity average was within the configured range. The monthly in-range performance was 83.7%.</w:t>
-      </w:r>
-      <w:r>
-        <w:br/>
-      </w:r>
-      <w:r>
-        <w:rPr>
-          <w:i/>
-          <w:color w:val="333333"/>
-          <w:sz w:val="19"/>
-        </w:rPr>
-        <w:t>Likely reason: makeup and blowdown control are balanced, so tower cycles remained steady.</w:t>
+        <w:t>The average conductivity is 597.6 µS/cm, which is within the recommended setpoint range of 570-630 µS/cm. Conductivity remained broadly stable from about 596.3 µS/cm at the start of the month to 599.0 µS/cm at the end. Recommendation: makeup and blowdown control are balanced, so tower cycles remained steady.</w:t>
       </w:r>
     </w:p>
     <w:p>

</xml_diff>